<commit_message>
feat: insert all 18 UML/UI diagrams into BTCN docx file
Agent-Logs-Url: https://github.com/Dungnong/cnpm/sessions/65216049-bb25-46f6-b766-12cbc8e06e60

Co-authored-by: Dungnong <185522719+Dungnong@users.noreply.github.com>
</commit_message>
<xml_diff>
--- a/BTCN_Module_Thong_Ke_Nong_Manh_Dung_B23DCCN206.docx
+++ b/BTCN_Module_Thong_Ke_Nong_Manh_Dung_B23DCCN206.docx
@@ -413,12 +413,38 @@
         <w:jc w:val="center"/>
       </w:pPr>
       <w:r>
-        <w:rPr>
-          <w:b w:val="0"/>
-          <w:i/>
-          <w:sz w:val="24"/>
-        </w:rPr>
-        <w:t>[Sơ đồ UC tổng quan]</w:t>
+        <w:drawing>
+          <wp:inline xmlns:a="http://schemas.openxmlformats.org/drawingml/2006/main" xmlns:pic="http://schemas.openxmlformats.org/drawingml/2006/picture">
+            <wp:extent cx="5029200" cy="4103580"/>
+            <wp:docPr id="1" name="Picture 1"/>
+            <wp:cNvGraphicFramePr>
+              <a:graphicFrameLocks noChangeAspect="1"/>
+            </wp:cNvGraphicFramePr>
+            <a:graphic>
+              <a:graphicData uri="http://schemas.openxmlformats.org/drawingml/2006/picture">
+                <pic:pic>
+                  <pic:nvPicPr>
+                    <pic:cNvPr id="0" name="uc_tong_quan.png"/>
+                    <pic:cNvPicPr/>
+                  </pic:nvPicPr>
+                  <pic:blipFill>
+                    <a:blip r:embed="rId9"/>
+                    <a:stretch>
+                      <a:fillRect/>
+                    </a:stretch>
+                  </pic:blipFill>
+                  <pic:spPr>
+                    <a:xfrm>
+                      <a:off x="0" y="0"/>
+                      <a:ext cx="5029200" cy="4103580"/>
+                    </a:xfrm>
+                    <a:prstGeom prst="rect"/>
+                  </pic:spPr>
+                </pic:pic>
+              </a:graphicData>
+            </a:graphic>
+          </wp:inline>
+        </w:drawing>
       </w:r>
     </w:p>
     <w:p>
@@ -1857,12 +1883,38 @@
         <w:jc w:val="center"/>
       </w:pPr>
       <w:r>
-        <w:rPr>
-          <w:b w:val="0"/>
-          <w:i/>
-          <w:sz w:val="24"/>
-        </w:rPr>
-        <w:t>[Sơ đồ lớp thực thể (phân tích)]</w:t>
+        <w:drawing>
+          <wp:inline xmlns:a="http://schemas.openxmlformats.org/drawingml/2006/main" xmlns:pic="http://schemas.openxmlformats.org/drawingml/2006/picture">
+            <wp:extent cx="5029200" cy="1709928"/>
+            <wp:docPr id="2" name="Picture 2"/>
+            <wp:cNvGraphicFramePr>
+              <a:graphicFrameLocks noChangeAspect="1"/>
+            </wp:cNvGraphicFramePr>
+            <a:graphic>
+              <a:graphicData uri="http://schemas.openxmlformats.org/drawingml/2006/picture">
+                <pic:pic>
+                  <pic:nvPicPr>
+                    <pic:cNvPr id="0" name="class_entity.png"/>
+                    <pic:cNvPicPr/>
+                  </pic:nvPicPr>
+                  <pic:blipFill>
+                    <a:blip r:embed="rId10"/>
+                    <a:stretch>
+                      <a:fillRect/>
+                    </a:stretch>
+                  </pic:blipFill>
+                  <pic:spPr>
+                    <a:xfrm>
+                      <a:off x="0" y="0"/>
+                      <a:ext cx="5029200" cy="1709928"/>
+                    </a:xfrm>
+                    <a:prstGeom prst="rect"/>
+                  </pic:spPr>
+                </pic:pic>
+              </a:graphicData>
+            </a:graphic>
+          </wp:inline>
+        </w:drawing>
       </w:r>
     </w:p>
     <w:p>
@@ -2086,12 +2138,38 @@
         <w:jc w:val="center"/>
       </w:pPr>
       <w:r>
-        <w:rPr>
-          <w:b w:val="0"/>
-          <w:i/>
-          <w:sz w:val="24"/>
-        </w:rPr>
-        <w:t>[Sơ đồ lớp phân tích - Module View income stats]</w:t>
+        <w:drawing>
+          <wp:inline xmlns:a="http://schemas.openxmlformats.org/drawingml/2006/main" xmlns:pic="http://schemas.openxmlformats.org/drawingml/2006/picture">
+            <wp:extent cx="4572000" cy="8338868"/>
+            <wp:docPr id="3" name="Picture 3"/>
+            <wp:cNvGraphicFramePr>
+              <a:graphicFrameLocks noChangeAspect="1"/>
+            </wp:cNvGraphicFramePr>
+            <a:graphic>
+              <a:graphicData uri="http://schemas.openxmlformats.org/drawingml/2006/picture">
+                <pic:pic>
+                  <pic:nvPicPr>
+                    <pic:cNvPr id="0" name="class_analysis_income.png"/>
+                    <pic:cNvPicPr/>
+                  </pic:nvPicPr>
+                  <pic:blipFill>
+                    <a:blip r:embed="rId11"/>
+                    <a:stretch>
+                      <a:fillRect/>
+                    </a:stretch>
+                  </pic:blipFill>
+                  <pic:spPr>
+                    <a:xfrm>
+                      <a:off x="0" y="0"/>
+                      <a:ext cx="4572000" cy="8338868"/>
+                    </a:xfrm>
+                    <a:prstGeom prst="rect"/>
+                  </pic:spPr>
+                </pic:pic>
+              </a:graphicData>
+            </a:graphic>
+          </wp:inline>
+        </w:drawing>
       </w:r>
     </w:p>
     <w:p>
@@ -2099,12 +2177,38 @@
         <w:jc w:val="center"/>
       </w:pPr>
       <w:r>
-        <w:rPr>
-          <w:b w:val="0"/>
-          <w:i/>
-          <w:sz w:val="24"/>
-        </w:rPr>
-        <w:t>[Biểu đồ tuần tự phân tích - Module View income stats]</w:t>
+        <w:drawing>
+          <wp:inline xmlns:a="http://schemas.openxmlformats.org/drawingml/2006/main" xmlns:pic="http://schemas.openxmlformats.org/drawingml/2006/picture">
+            <wp:extent cx="5029200" cy="3768600"/>
+            <wp:docPr id="4" name="Picture 4"/>
+            <wp:cNvGraphicFramePr>
+              <a:graphicFrameLocks noChangeAspect="1"/>
+            </wp:cNvGraphicFramePr>
+            <a:graphic>
+              <a:graphicData uri="http://schemas.openxmlformats.org/drawingml/2006/picture">
+                <pic:pic>
+                  <pic:nvPicPr>
+                    <pic:cNvPr id="0" name="seq_analysis_income.png"/>
+                    <pic:cNvPicPr/>
+                  </pic:nvPicPr>
+                  <pic:blipFill>
+                    <a:blip r:embed="rId12"/>
+                    <a:stretch>
+                      <a:fillRect/>
+                    </a:stretch>
+                  </pic:blipFill>
+                  <pic:spPr>
+                    <a:xfrm>
+                      <a:off x="0" y="0"/>
+                      <a:ext cx="5029200" cy="3768600"/>
+                    </a:xfrm>
+                    <a:prstGeom prst="rect"/>
+                  </pic:spPr>
+                </pic:pic>
+              </a:graphicData>
+            </a:graphic>
+          </wp:inline>
+        </w:drawing>
       </w:r>
     </w:p>
     <w:p>
@@ -2316,12 +2420,38 @@
         <w:jc w:val="center"/>
       </w:pPr>
       <w:r>
-        <w:rPr>
-          <w:b w:val="0"/>
-          <w:i/>
-          <w:sz w:val="24"/>
-        </w:rPr>
-        <w:t>[Sơ đồ lớp phân tích - Module View pitch stats]</w:t>
+        <w:drawing>
+          <wp:inline xmlns:a="http://schemas.openxmlformats.org/drawingml/2006/main" xmlns:pic="http://schemas.openxmlformats.org/drawingml/2006/picture">
+            <wp:extent cx="4572000" cy="9553902"/>
+            <wp:docPr id="5" name="Picture 5"/>
+            <wp:cNvGraphicFramePr>
+              <a:graphicFrameLocks noChangeAspect="1"/>
+            </wp:cNvGraphicFramePr>
+            <a:graphic>
+              <a:graphicData uri="http://schemas.openxmlformats.org/drawingml/2006/picture">
+                <pic:pic>
+                  <pic:nvPicPr>
+                    <pic:cNvPr id="0" name="class_analysis_pitch.png"/>
+                    <pic:cNvPicPr/>
+                  </pic:nvPicPr>
+                  <pic:blipFill>
+                    <a:blip r:embed="rId13"/>
+                    <a:stretch>
+                      <a:fillRect/>
+                    </a:stretch>
+                  </pic:blipFill>
+                  <pic:spPr>
+                    <a:xfrm>
+                      <a:off x="0" y="0"/>
+                      <a:ext cx="4572000" cy="9553902"/>
+                    </a:xfrm>
+                    <a:prstGeom prst="rect"/>
+                  </pic:spPr>
+                </pic:pic>
+              </a:graphicData>
+            </a:graphic>
+          </wp:inline>
+        </w:drawing>
       </w:r>
     </w:p>
     <w:p>
@@ -2329,12 +2459,38 @@
         <w:jc w:val="center"/>
       </w:pPr>
       <w:r>
-        <w:rPr>
-          <w:b w:val="0"/>
-          <w:i/>
-          <w:sz w:val="24"/>
-        </w:rPr>
-        <w:t>[Biểu đồ tuần tự phân tích - Module View pitch stats]</w:t>
+        <w:drawing>
+          <wp:inline xmlns:a="http://schemas.openxmlformats.org/drawingml/2006/main" xmlns:pic="http://schemas.openxmlformats.org/drawingml/2006/picture">
+            <wp:extent cx="5029200" cy="3896436"/>
+            <wp:docPr id="6" name="Picture 6"/>
+            <wp:cNvGraphicFramePr>
+              <a:graphicFrameLocks noChangeAspect="1"/>
+            </wp:cNvGraphicFramePr>
+            <a:graphic>
+              <a:graphicData uri="http://schemas.openxmlformats.org/drawingml/2006/picture">
+                <pic:pic>
+                  <pic:nvPicPr>
+                    <pic:cNvPr id="0" name="seq_analysis_pitch.png"/>
+                    <pic:cNvPicPr/>
+                  </pic:nvPicPr>
+                  <pic:blipFill>
+                    <a:blip r:embed="rId14"/>
+                    <a:stretch>
+                      <a:fillRect/>
+                    </a:stretch>
+                  </pic:blipFill>
+                  <pic:spPr>
+                    <a:xfrm>
+                      <a:off x="0" y="0"/>
+                      <a:ext cx="5029200" cy="3896436"/>
+                    </a:xfrm>
+                    <a:prstGeom prst="rect"/>
+                  </pic:spPr>
+                </pic:pic>
+              </a:graphicData>
+            </a:graphic>
+          </wp:inline>
+        </w:drawing>
       </w:r>
     </w:p>
     <w:p>
@@ -2546,12 +2702,38 @@
         <w:jc w:val="center"/>
       </w:pPr>
       <w:r>
-        <w:rPr>
-          <w:b w:val="0"/>
-          <w:i/>
-          <w:sz w:val="24"/>
-        </w:rPr>
-        <w:t>[Sơ đồ lớp phân tích - Module View customer stats]</w:t>
+        <w:drawing>
+          <wp:inline xmlns:a="http://schemas.openxmlformats.org/drawingml/2006/main" xmlns:pic="http://schemas.openxmlformats.org/drawingml/2006/picture">
+            <wp:extent cx="4572000" cy="9037320"/>
+            <wp:docPr id="7" name="Picture 7"/>
+            <wp:cNvGraphicFramePr>
+              <a:graphicFrameLocks noChangeAspect="1"/>
+            </wp:cNvGraphicFramePr>
+            <a:graphic>
+              <a:graphicData uri="http://schemas.openxmlformats.org/drawingml/2006/picture">
+                <pic:pic>
+                  <pic:nvPicPr>
+                    <pic:cNvPr id="0" name="class_analysis_customer.png"/>
+                    <pic:cNvPicPr/>
+                  </pic:nvPicPr>
+                  <pic:blipFill>
+                    <a:blip r:embed="rId15"/>
+                    <a:stretch>
+                      <a:fillRect/>
+                    </a:stretch>
+                  </pic:blipFill>
+                  <pic:spPr>
+                    <a:xfrm>
+                      <a:off x="0" y="0"/>
+                      <a:ext cx="4572000" cy="9037320"/>
+                    </a:xfrm>
+                    <a:prstGeom prst="rect"/>
+                  </pic:spPr>
+                </pic:pic>
+              </a:graphicData>
+            </a:graphic>
+          </wp:inline>
+        </w:drawing>
       </w:r>
     </w:p>
     <w:p>
@@ -2559,12 +2741,38 @@
         <w:jc w:val="center"/>
       </w:pPr>
       <w:r>
-        <w:rPr>
-          <w:b w:val="0"/>
-          <w:i/>
-          <w:sz w:val="24"/>
-        </w:rPr>
-        <w:t>[Biểu đồ tuần tự phân tích - Module View customer stats]</w:t>
+        <w:drawing>
+          <wp:inline xmlns:a="http://schemas.openxmlformats.org/drawingml/2006/main" xmlns:pic="http://schemas.openxmlformats.org/drawingml/2006/picture">
+            <wp:extent cx="5029200" cy="3808585"/>
+            <wp:docPr id="8" name="Picture 8"/>
+            <wp:cNvGraphicFramePr>
+              <a:graphicFrameLocks noChangeAspect="1"/>
+            </wp:cNvGraphicFramePr>
+            <a:graphic>
+              <a:graphicData uri="http://schemas.openxmlformats.org/drawingml/2006/picture">
+                <pic:pic>
+                  <pic:nvPicPr>
+                    <pic:cNvPr id="0" name="seq_analysis_customer.png"/>
+                    <pic:cNvPicPr/>
+                  </pic:nvPicPr>
+                  <pic:blipFill>
+                    <a:blip r:embed="rId16"/>
+                    <a:stretch>
+                      <a:fillRect/>
+                    </a:stretch>
+                  </pic:blipFill>
+                  <pic:spPr>
+                    <a:xfrm>
+                      <a:off x="0" y="0"/>
+                      <a:ext cx="5029200" cy="3808585"/>
+                    </a:xfrm>
+                    <a:prstGeom prst="rect"/>
+                  </pic:spPr>
+                </pic:pic>
+              </a:graphicData>
+            </a:graphic>
+          </wp:inline>
+        </w:drawing>
       </w:r>
     </w:p>
     <w:p>
@@ -2776,12 +2984,38 @@
         <w:jc w:val="center"/>
       </w:pPr>
       <w:r>
-        <w:rPr>
-          <w:b w:val="0"/>
-          <w:i/>
-          <w:sz w:val="24"/>
-        </w:rPr>
-        <w:t>[Sơ đồ lớp phân tích - Module View service stats]</w:t>
+        <w:drawing>
+          <wp:inline xmlns:a="http://schemas.openxmlformats.org/drawingml/2006/main" xmlns:pic="http://schemas.openxmlformats.org/drawingml/2006/picture">
+            <wp:extent cx="4572000" cy="8472488"/>
+            <wp:docPr id="9" name="Picture 9"/>
+            <wp:cNvGraphicFramePr>
+              <a:graphicFrameLocks noChangeAspect="1"/>
+            </wp:cNvGraphicFramePr>
+            <a:graphic>
+              <a:graphicData uri="http://schemas.openxmlformats.org/drawingml/2006/picture">
+                <pic:pic>
+                  <pic:nvPicPr>
+                    <pic:cNvPr id="0" name="class_analysis_service.png"/>
+                    <pic:cNvPicPr/>
+                  </pic:nvPicPr>
+                  <pic:blipFill>
+                    <a:blip r:embed="rId17"/>
+                    <a:stretch>
+                      <a:fillRect/>
+                    </a:stretch>
+                  </pic:blipFill>
+                  <pic:spPr>
+                    <a:xfrm>
+                      <a:off x="0" y="0"/>
+                      <a:ext cx="4572000" cy="8472488"/>
+                    </a:xfrm>
+                    <a:prstGeom prst="rect"/>
+                  </pic:spPr>
+                </pic:pic>
+              </a:graphicData>
+            </a:graphic>
+          </wp:inline>
+        </w:drawing>
       </w:r>
     </w:p>
     <w:p>
@@ -2789,12 +3023,38 @@
         <w:jc w:val="center"/>
       </w:pPr>
       <w:r>
-        <w:rPr>
-          <w:b w:val="0"/>
-          <w:i/>
-          <w:sz w:val="24"/>
-        </w:rPr>
-        <w:t>[Biểu đồ tuần tự phân tích - Module View service stats]</w:t>
+        <w:drawing>
+          <wp:inline xmlns:a="http://schemas.openxmlformats.org/drawingml/2006/main" xmlns:pic="http://schemas.openxmlformats.org/drawingml/2006/picture">
+            <wp:extent cx="5029200" cy="3773552"/>
+            <wp:docPr id="10" name="Picture 10"/>
+            <wp:cNvGraphicFramePr>
+              <a:graphicFrameLocks noChangeAspect="1"/>
+            </wp:cNvGraphicFramePr>
+            <a:graphic>
+              <a:graphicData uri="http://schemas.openxmlformats.org/drawingml/2006/picture">
+                <pic:pic>
+                  <pic:nvPicPr>
+                    <pic:cNvPr id="0" name="seq_analysis_service.png"/>
+                    <pic:cNvPicPr/>
+                  </pic:nvPicPr>
+                  <pic:blipFill>
+                    <a:blip r:embed="rId18"/>
+                    <a:stretch>
+                      <a:fillRect/>
+                    </a:stretch>
+                  </pic:blipFill>
+                  <pic:spPr>
+                    <a:xfrm>
+                      <a:off x="0" y="0"/>
+                      <a:ext cx="5029200" cy="3773552"/>
+                    </a:xfrm>
+                    <a:prstGeom prst="rect"/>
+                  </pic:spPr>
+                </pic:pic>
+              </a:graphicData>
+            </a:graphic>
+          </wp:inline>
+        </w:drawing>
       </w:r>
     </w:p>
     <w:p>
@@ -2879,12 +3139,38 @@
         <w:jc w:val="center"/>
       </w:pPr>
       <w:r>
-        <w:rPr>
-          <w:b w:val="0"/>
-          <w:i/>
-          <w:sz w:val="24"/>
-        </w:rPr>
-        <w:t>[Sơ đồ thực thể]</w:t>
+        <w:drawing>
+          <wp:inline xmlns:a="http://schemas.openxmlformats.org/drawingml/2006/main" xmlns:pic="http://schemas.openxmlformats.org/drawingml/2006/picture">
+            <wp:extent cx="5029200" cy="2644164"/>
+            <wp:docPr id="11" name="Picture 11"/>
+            <wp:cNvGraphicFramePr>
+              <a:graphicFrameLocks noChangeAspect="1"/>
+            </wp:cNvGraphicFramePr>
+            <a:graphic>
+              <a:graphicData uri="http://schemas.openxmlformats.org/drawingml/2006/picture">
+                <pic:pic>
+                  <pic:nvPicPr>
+                    <pic:cNvPr id="0" name="erd.png"/>
+                    <pic:cNvPicPr/>
+                  </pic:nvPicPr>
+                  <pic:blipFill>
+                    <a:blip r:embed="rId19"/>
+                    <a:stretch>
+                      <a:fillRect/>
+                    </a:stretch>
+                  </pic:blipFill>
+                  <pic:spPr>
+                    <a:xfrm>
+                      <a:off x="0" y="0"/>
+                      <a:ext cx="5029200" cy="2644164"/>
+                    </a:xfrm>
+                    <a:prstGeom prst="rect"/>
+                  </pic:spPr>
+                </pic:pic>
+              </a:graphicData>
+            </a:graphic>
+          </wp:inline>
+        </w:drawing>
       </w:r>
     </w:p>
     <w:p>
@@ -2916,12 +3202,38 @@
         <w:jc w:val="center"/>
       </w:pPr>
       <w:r>
-        <w:rPr>
-          <w:b w:val="0"/>
-          <w:i/>
-          <w:sz w:val="24"/>
-        </w:rPr>
-        <w:t>[Hình ảnh giao diện trang chủ Manager]</w:t>
+        <w:drawing>
+          <wp:inline xmlns:a="http://schemas.openxmlformats.org/drawingml/2006/main" xmlns:pic="http://schemas.openxmlformats.org/drawingml/2006/picture">
+            <wp:extent cx="5029200" cy="3233057"/>
+            <wp:docPr id="12" name="Picture 12"/>
+            <wp:cNvGraphicFramePr>
+              <a:graphicFrameLocks noChangeAspect="1"/>
+            </wp:cNvGraphicFramePr>
+            <a:graphic>
+              <a:graphicData uri="http://schemas.openxmlformats.org/drawingml/2006/picture">
+                <pic:pic>
+                  <pic:nvPicPr>
+                    <pic:cNvPr id="0" name="ui_home.png"/>
+                    <pic:cNvPicPr/>
+                  </pic:nvPicPr>
+                  <pic:blipFill>
+                    <a:blip r:embed="rId20"/>
+                    <a:stretch>
+                      <a:fillRect/>
+                    </a:stretch>
+                  </pic:blipFill>
+                  <pic:spPr>
+                    <a:xfrm>
+                      <a:off x="0" y="0"/>
+                      <a:ext cx="5029200" cy="3233057"/>
+                    </a:xfrm>
+                    <a:prstGeom prst="rect"/>
+                  </pic:spPr>
+                </pic:pic>
+              </a:graphicData>
+            </a:graphic>
+          </wp:inline>
+        </w:drawing>
       </w:r>
     </w:p>
     <w:p>
@@ -2941,12 +3253,38 @@
         <w:jc w:val="center"/>
       </w:pPr>
       <w:r>
-        <w:rPr>
-          <w:b w:val="0"/>
-          <w:i/>
-          <w:sz w:val="24"/>
-        </w:rPr>
-        <w:t>[Hình ảnh giao diện View report với 4 nút: Thống kê doanh thu, Thống kê sân, Thống kê khách hàng, Thống kê dịch vụ]</w:t>
+        <w:drawing>
+          <wp:inline xmlns:a="http://schemas.openxmlformats.org/drawingml/2006/main" xmlns:pic="http://schemas.openxmlformats.org/drawingml/2006/picture">
+            <wp:extent cx="4114800" cy="2743200"/>
+            <wp:docPr id="13" name="Picture 13"/>
+            <wp:cNvGraphicFramePr>
+              <a:graphicFrameLocks noChangeAspect="1"/>
+            </wp:cNvGraphicFramePr>
+            <a:graphic>
+              <a:graphicData uri="http://schemas.openxmlformats.org/drawingml/2006/picture">
+                <pic:pic>
+                  <pic:nvPicPr>
+                    <pic:cNvPr id="0" name="ui_report.png"/>
+                    <pic:cNvPicPr/>
+                  </pic:nvPicPr>
+                  <pic:blipFill>
+                    <a:blip r:embed="rId21"/>
+                    <a:stretch>
+                      <a:fillRect/>
+                    </a:stretch>
+                  </pic:blipFill>
+                  <pic:spPr>
+                    <a:xfrm>
+                      <a:off x="0" y="0"/>
+                      <a:ext cx="4114800" cy="2743200"/>
+                    </a:xfrm>
+                    <a:prstGeom prst="rect"/>
+                  </pic:spPr>
+                </pic:pic>
+              </a:graphicData>
+            </a:graphic>
+          </wp:inline>
+        </w:drawing>
       </w:r>
     </w:p>
     <w:p>
@@ -2966,12 +3304,38 @@
         <w:jc w:val="center"/>
       </w:pPr>
       <w:r>
-        <w:rPr>
-          <w:b w:val="0"/>
-          <w:i/>
-          <w:sz w:val="24"/>
-        </w:rPr>
-        <w:t>[Hình ảnh giao diện xem thống kê doanh thu]</w:t>
+        <w:drawing>
+          <wp:inline xmlns:a="http://schemas.openxmlformats.org/drawingml/2006/main" xmlns:pic="http://schemas.openxmlformats.org/drawingml/2006/picture">
+            <wp:extent cx="5029200" cy="3592286"/>
+            <wp:docPr id="14" name="Picture 14"/>
+            <wp:cNvGraphicFramePr>
+              <a:graphicFrameLocks noChangeAspect="1"/>
+            </wp:cNvGraphicFramePr>
+            <a:graphic>
+              <a:graphicData uri="http://schemas.openxmlformats.org/drawingml/2006/picture">
+                <pic:pic>
+                  <pic:nvPicPr>
+                    <pic:cNvPr id="0" name="ui_income.png"/>
+                    <pic:cNvPicPr/>
+                  </pic:nvPicPr>
+                  <pic:blipFill>
+                    <a:blip r:embed="rId22"/>
+                    <a:stretch>
+                      <a:fillRect/>
+                    </a:stretch>
+                  </pic:blipFill>
+                  <pic:spPr>
+                    <a:xfrm>
+                      <a:off x="0" y="0"/>
+                      <a:ext cx="5029200" cy="3592286"/>
+                    </a:xfrm>
+                    <a:prstGeom prst="rect"/>
+                  </pic:spPr>
+                </pic:pic>
+              </a:graphicData>
+            </a:graphic>
+          </wp:inline>
+        </w:drawing>
       </w:r>
     </w:p>
     <w:p>
@@ -2979,12 +3343,38 @@
         <w:jc w:val="center"/>
       </w:pPr>
       <w:r>
-        <w:rPr>
-          <w:b w:val="0"/>
-          <w:i/>
-          <w:sz w:val="24"/>
-        </w:rPr>
-        <w:t>[Hình ảnh giao diện xem thống kê sân]</w:t>
+        <w:drawing>
+          <wp:inline xmlns:a="http://schemas.openxmlformats.org/drawingml/2006/main" xmlns:pic="http://schemas.openxmlformats.org/drawingml/2006/picture">
+            <wp:extent cx="5029200" cy="3486912"/>
+            <wp:docPr id="15" name="Picture 15"/>
+            <wp:cNvGraphicFramePr>
+              <a:graphicFrameLocks noChangeAspect="1"/>
+            </wp:cNvGraphicFramePr>
+            <a:graphic>
+              <a:graphicData uri="http://schemas.openxmlformats.org/drawingml/2006/picture">
+                <pic:pic>
+                  <pic:nvPicPr>
+                    <pic:cNvPr id="0" name="ui_pitch.png"/>
+                    <pic:cNvPicPr/>
+                  </pic:nvPicPr>
+                  <pic:blipFill>
+                    <a:blip r:embed="rId23"/>
+                    <a:stretch>
+                      <a:fillRect/>
+                    </a:stretch>
+                  </pic:blipFill>
+                  <pic:spPr>
+                    <a:xfrm>
+                      <a:off x="0" y="0"/>
+                      <a:ext cx="5029200" cy="3486912"/>
+                    </a:xfrm>
+                    <a:prstGeom prst="rect"/>
+                  </pic:spPr>
+                </pic:pic>
+              </a:graphicData>
+            </a:graphic>
+          </wp:inline>
+        </w:drawing>
       </w:r>
     </w:p>
     <w:p>
@@ -3220,12 +3610,38 @@
         <w:jc w:val="center"/>
       </w:pPr>
       <w:r>
-        <w:rPr>
-          <w:b w:val="0"/>
-          <w:i/>
-          <w:sz w:val="24"/>
-        </w:rPr>
-        <w:t>[Sơ đồ lớp chi tiết theo mô hình MVC thuần - Module View Report]</w:t>
+        <w:drawing>
+          <wp:inline xmlns:a="http://schemas.openxmlformats.org/drawingml/2006/main" xmlns:pic="http://schemas.openxmlformats.org/drawingml/2006/picture">
+            <wp:extent cx="5486400" cy="3853261"/>
+            <wp:docPr id="16" name="Picture 16"/>
+            <wp:cNvGraphicFramePr>
+              <a:graphicFrameLocks noChangeAspect="1"/>
+            </wp:cNvGraphicFramePr>
+            <a:graphic>
+              <a:graphicData uri="http://schemas.openxmlformats.org/drawingml/2006/picture">
+                <pic:pic>
+                  <pic:nvPicPr>
+                    <pic:cNvPr id="0" name="class_mvc.png"/>
+                    <pic:cNvPicPr/>
+                  </pic:nvPicPr>
+                  <pic:blipFill>
+                    <a:blip r:embed="rId24"/>
+                    <a:stretch>
+                      <a:fillRect/>
+                    </a:stretch>
+                  </pic:blipFill>
+                  <pic:spPr>
+                    <a:xfrm>
+                      <a:off x="0" y="0"/>
+                      <a:ext cx="5486400" cy="3853261"/>
+                    </a:xfrm>
+                    <a:prstGeom prst="rect"/>
+                  </pic:spPr>
+                </pic:pic>
+              </a:graphicData>
+            </a:graphic>
+          </wp:inline>
+        </w:drawing>
       </w:r>
     </w:p>
     <w:p>
@@ -3434,12 +3850,38 @@
         <w:jc w:val="center"/>
       </w:pPr>
       <w:r>
-        <w:rPr>
-          <w:b w:val="0"/>
-          <w:i/>
-          <w:sz w:val="24"/>
-        </w:rPr>
-        <w:t>[Sơ đồ tuần tự thiết kế - Module View income stats]</w:t>
+        <w:drawing>
+          <wp:inline xmlns:a="http://schemas.openxmlformats.org/drawingml/2006/main" xmlns:pic="http://schemas.openxmlformats.org/drawingml/2006/picture">
+            <wp:extent cx="5029200" cy="3629914"/>
+            <wp:docPr id="17" name="Picture 17"/>
+            <wp:cNvGraphicFramePr>
+              <a:graphicFrameLocks noChangeAspect="1"/>
+            </wp:cNvGraphicFramePr>
+            <a:graphic>
+              <a:graphicData uri="http://schemas.openxmlformats.org/drawingml/2006/picture">
+                <pic:pic>
+                  <pic:nvPicPr>
+                    <pic:cNvPr id="0" name="seq_design_income.png"/>
+                    <pic:cNvPicPr/>
+                  </pic:nvPicPr>
+                  <pic:blipFill>
+                    <a:blip r:embed="rId25"/>
+                    <a:stretch>
+                      <a:fillRect/>
+                    </a:stretch>
+                  </pic:blipFill>
+                  <pic:spPr>
+                    <a:xfrm>
+                      <a:off x="0" y="0"/>
+                      <a:ext cx="5029200" cy="3629914"/>
+                    </a:xfrm>
+                    <a:prstGeom prst="rect"/>
+                  </pic:spPr>
+                </pic:pic>
+              </a:graphicData>
+            </a:graphic>
+          </wp:inline>
+        </w:drawing>
       </w:r>
     </w:p>
     <w:p>
@@ -3447,12 +3889,38 @@
         <w:jc w:val="center"/>
       </w:pPr>
       <w:r>
-        <w:rPr>
-          <w:b w:val="0"/>
-          <w:i/>
-          <w:sz w:val="24"/>
-        </w:rPr>
-        <w:t>[Sơ đồ tuần tự thiết kế - Module View pitch stats (tương tự)]</w:t>
+        <w:drawing>
+          <wp:inline xmlns:a="http://schemas.openxmlformats.org/drawingml/2006/main" xmlns:pic="http://schemas.openxmlformats.org/drawingml/2006/picture">
+            <wp:extent cx="5029200" cy="3681124"/>
+            <wp:docPr id="18" name="Picture 18"/>
+            <wp:cNvGraphicFramePr>
+              <a:graphicFrameLocks noChangeAspect="1"/>
+            </wp:cNvGraphicFramePr>
+            <a:graphic>
+              <a:graphicData uri="http://schemas.openxmlformats.org/drawingml/2006/picture">
+                <pic:pic>
+                  <pic:nvPicPr>
+                    <pic:cNvPr id="0" name="seq_design_pitch.png"/>
+                    <pic:cNvPicPr/>
+                  </pic:nvPicPr>
+                  <pic:blipFill>
+                    <a:blip r:embed="rId26"/>
+                    <a:stretch>
+                      <a:fillRect/>
+                    </a:stretch>
+                  </pic:blipFill>
+                  <pic:spPr>
+                    <a:xfrm>
+                      <a:off x="0" y="0"/>
+                      <a:ext cx="5029200" cy="3681124"/>
+                    </a:xfrm>
+                    <a:prstGeom prst="rect"/>
+                  </pic:spPr>
+                </pic:pic>
+              </a:graphicData>
+            </a:graphic>
+          </wp:inline>
+        </w:drawing>
       </w:r>
     </w:p>
     <w:p>

</xml_diff>